<commit_message>
Lock target venue and fix abstract length for submission compliance
- paper_draft.md: target venue set to Education and Information
  Technologies (Springer), backup IJETHE (SpringerOpen)
- manuscript.docx: abstract trimmed from 334 to 244 words to meet the
  journal's confirmed 150-250 word limit (structure preserved)
</commit_message>
<xml_diff>
--- a/submission/manuscript.docx
+++ b/submission/manuscript.docx
@@ -44,14 +44,13 @@
           <w:sz w:val="22"/>
           <w:szCs w:val="22"/>
         </w:rPr>
-        <w:t xml:space="preserve">Purpose: </w:t>
-      </w:r>
-      <w:r>
-        <w:rPr>
-          <w:sz w:val="22"/>
-          <w:szCs w:val="22"/>
-        </w:rPr>
-        <w:t xml:space="preserve">Knowledge tracing (KT) — predicting next-question correctness from student interaction history — is foundational to adaptive learning. We ask whether modern frontier large language models (LLMs) can replace specialized KT models, how performance depends on provider and prompting strategy, and what structural differences distinguish LLM predictions from those of trained KT models.</w:t>
+        <w:t>Purpose: Knowledge tracing (KT) predicts next-question correctness from student interaction history and underpins adaptive learning. We test whether frontier large language models (LLMs) can replace specialized KT models, how performance depends on provider and prompting strategy, and what distinguishes LLM predictions from those of trained KT models.</w:t>
+      </w:r>
+      <w:r>
+        <w:rPr>
+          <w:sz w:val="22"/>
+          <w:szCs w:val="22"/>
+        </w:rPr>
       </w:r>
     </w:p>
     <w:p>
@@ -66,14 +65,13 @@
           <w:sz w:val="22"/>
           <w:szCs w:val="22"/>
         </w:rPr>
-        <w:t xml:space="preserve">Method: </w:t>
-      </w:r>
-      <w:r>
-        <w:rPr>
-          <w:sz w:val="22"/>
-          <w:szCs w:val="22"/>
-        </w:rPr>
-        <w:t xml:space="preserve">We benchmark nine conditions on ASSISTments-2009 corrected under identical student-level splits and a uniform AUC protocol: a trivial-majority baseline; four specialized KT models (BKT, DKT, SAKT, AKT); and four LLM conditions crossing two providers (Anthropic Claude Haiku 4.5, OpenAI GPT-4o-mini) with two prompting strategies (zero-shot, few-shot). All comparisons report 95% bootstrap confidence intervals. We additionally analyse 6,680 LLM predictions for calibration, output distributions, inter-LLM agreement, and per-prediction cost.</w:t>
+        <w:t>Method: We benchmark nine conditions on ASSISTments-2009 corrected under identical student-level splits and a uniform AUC protocol: a trivial baseline; four specialized KT models (BKT, DKT, SAKT, AKT); and four LLM conditions crossing two providers (Claude Haiku 4.5, GPT-4o-mini) and two prompting strategies, all with 95% bootstrap confidence intervals. We also analyse 6,680 LLM predictions for calibration, output distributions, inter-LLM agreement, and cost.</w:t>
+      </w:r>
+      <w:r>
+        <w:rPr>
+          <w:sz w:val="22"/>
+          <w:szCs w:val="22"/>
+        </w:rPr>
       </w:r>
     </w:p>
     <w:p>
@@ -88,14 +86,13 @@
           <w:sz w:val="22"/>
           <w:szCs w:val="22"/>
         </w:rPr>
-        <w:t xml:space="preserve">Findings: </w:t>
-      </w:r>
-      <w:r>
-        <w:rPr>
-          <w:sz w:val="22"/>
-          <w:szCs w:val="22"/>
-        </w:rPr>
-        <w:t xml:space="preserve">Specialized KT models outperform every LLM condition: DKT achieves AUC 0.763 [95% CI 0.757, 0.768] versus the best LLM condition's 0.711 [0.686, 0.738], a 0.052 gap (p &lt; 0.001, paired bootstrap). All four LLM conditions are statistically indistinguishable (range 0.696–0.711, all CIs overlap); both providers in zero-shot reach AUC ≈ 0.70, above BKT (0.678) and approaching SAKT (0.720). Beyond ranking, LLMs exhibit three structural deficits: (i) per-position AUC is flat (Pearson r = −0.04), so additional student history is not used; (ii) probabilities are miscalibrated (ECE 0.10–0.12) and anchored to a few human-readable values (GPT-4o-mini few-shot uses only 29 unique values; the top-five cover 60% of predictions); and (iii) the four conditions correlate at Pearson 0.83–0.93 on individual predictions, consistent with a shared task ceiling.</w:t>
+        <w:t>Findings: Specialized KT models outperform every LLM condition: DKT reaches AUC 0.763 [0.757, 0.768] versus the best LLM's 0.711 [0.686, 0.738] (p &lt; 0.001). All four LLM conditions are statistically indistinguishable (0.696–0.711) yet exceed BKT (0.678) and approach SAKT (0.722). LLMs also show three deficits: per-position AUC is flat, so extra history goes unused; probabilities are miscalibrated (ECE 0.10–0.12) and anchored to round values; and the four conditions correlate at r = 0.83–0.93, consistent with a shared task ceiling.</w:t>
+      </w:r>
+      <w:r>
+        <w:rPr>
+          <w:sz w:val="22"/>
+          <w:szCs w:val="22"/>
+        </w:rPr>
       </w:r>
     </w:p>
     <w:p>
@@ -110,14 +107,13 @@
           <w:sz w:val="22"/>
           <w:szCs w:val="22"/>
         </w:rPr>
-        <w:t xml:space="preserve">Originality: </w:t>
-      </w:r>
-      <w:r>
-        <w:rPr>
-          <w:sz w:val="22"/>
-          <w:szCs w:val="22"/>
-        </w:rPr>
-        <w:t xml:space="preserve">This is the first multi-provider LLM-KT benchmark on a public dataset to combine bootstrap confidence intervals with prediction-level analyses of calibration, output anchoring, and inter-LLM agreement, refining recent claims that LLMs are categorically unsuitable for KT (Bhattacharyya et al., 2026).</w:t>
+        <w:t>Originality: This is the first multi-provider LLM-KT benchmark on a public dataset combining bootstrap confidence intervals with prediction-level analyses of calibration, anchoring, and inter-LLM agreement.</w:t>
+      </w:r>
+      <w:r>
+        <w:rPr>
+          <w:sz w:val="22"/>
+          <w:szCs w:val="22"/>
+        </w:rPr>
       </w:r>
     </w:p>
     <w:p>
@@ -132,14 +128,13 @@
           <w:sz w:val="22"/>
           <w:szCs w:val="22"/>
         </w:rPr>
-        <w:t xml:space="preserve">Implications: </w:t>
-      </w:r>
-      <w:r>
-        <w:rPr>
-          <w:sz w:val="22"/>
-          <w:szCs w:val="22"/>
-        </w:rPr>
-        <w:t>Specialized KT models dominate the cost-accuracy Pareto frontier — highest AUC at zero marginal cost, while LLM API calls cost $0.03–$0.40 per 1,000 predictions ($126–$1,580 per year at a realistic four-million-prediction deployment). The deficits we identify point to concrete targets for hybrid LLM–KT architectures.</w:t>
+        <w:t>Implications: Specialized models dominate the cost-accuracy frontier at zero marginal cost, while LLM calls cost $0.03–$0.40 per 1,000 predictions ($126–$1,580/year at scale), pointing to concrete targets for hybrid LLM-KT architectures.</w:t>
+      </w:r>
+      <w:r>
+        <w:rPr>
+          <w:sz w:val="22"/>
+          <w:szCs w:val="22"/>
+        </w:rPr>
       </w:r>
     </w:p>
     <w:p>

</xml_diff>

<commit_message>
Add AI Use Disclosure section (§3.5) per journal policy
Education and Information Technologies requires AI use beyond copy
editing to be documented in the Methods section. Discloses AI
assistance in model implementation, statistical analysis, reference
verification, and manuscript drafting/editing.
</commit_message>
<xml_diff>
--- a/submission/manuscript.docx
+++ b/submission/manuscript.docx
@@ -879,6 +879,23 @@
           <w:szCs w:val="22"/>
         </w:rPr>
         <w:t xml:space="preserve">All experiments use a fixed random seed (42) for sampling, train/validation/test splitting, and bootstrap resampling, ensuring reproducibility of the reported numbers from the released code.</w:t>
+      </w:r>
+    </w:p>
+    <w:p>
+      <w:pPr>
+        <w:pStyle w:val="Heading2"/>
+      </w:pPr>
+      <w:r>
+        <w:rPr>
+          <w:b/>
+          <w:sz w:val="24"/>
+        </w:rPr>
+        <w:t>3.5 AI Use Disclosure</w:t>
+      </w:r>
+    </w:p>
+    <w:p>
+      <w:r>
+        <w:t>The authors used AI assistance (Claude) throughout this project's development, including implementation and debugging of the specialized knowledge tracing models (BKT, DKT, SAKT, AKT) and the multi-provider LLM evaluation pipeline; statistical analysis, including bootstrap confidence intervals, calibration metrics, and cost calculations; independent verification of literature citations; and drafting and revision of the manuscript text. All AI-assisted code, analyses, and text were reviewed and verified by the authors, who take full responsibility for the accuracy, integrity, and scientific validity of the final manuscript.</w:t>
       </w:r>
     </w:p>
     <w:p>

</xml_diff>

<commit_message>
Restructure title page and fix figure caption format for journal compliance
- Consolidate Funding/Competing Interests/Ethics/Consent/Data/Code
  availability/Author Contributions under one "Statements and
  Declarations" heading, per journal requirement
- Rename "Conflict of Interest" -> "Competing Interests" to match
  the journal's terminology
- Add missing "Consent" statement (not applicable - pre-existing
  de-identified dataset, no new human-subjects data collection)
- Figure captions: "Figure 2." -> bold "Fig. 2" with no punctuation
  after the number or at the end of the caption, per spec
</commit_message>
<xml_diff>
--- a/submission/manuscript.docx
+++ b/submission/manuscript.docx
@@ -2816,12 +2816,20 @@
       </w:pPr>
       <w:r>
         <w:rPr>
-          <w:i/>
+          <w:b/>
+          <w:i w:val="0"/>
           <w:iCs/>
           <w:sz w:val="20"/>
           <w:szCs w:val="20"/>
         </w:rPr>
-        <w:t xml:space="preserve">Figure 2. Left: per-position AUC pooled across all four LLM conditions with a ±1-step smoothing window. The trajectory is flat from position 1 to 20, indicating that additional student history beyond the 5-interaction warm-up does not improve LLM predictions. The dashed blue line marks DKT's test AUC of 0.763 for reference. Right: reliability diagram showing systematic underconfidence in mid-range LLM predictions across all four conditions.</w:t>
+        <w:t>Fig. 2</w:t>
+      </w:r>
+      <w:r>
+        <w:rPr>
+          <w:b w:val="0"/>
+          <w:i w:val="0"/>
+        </w:rPr>
+        <w:t xml:space="preserve"> Left: per-position AUC pooled across all four LLM conditions with a ±1-step smoothing window. The trajectory is flat from position 1 to 20, indicating that additional student history beyond the 5-interaction warm-up does not improve LLM predictions. The dashed blue line marks DKT's test AUC of 0.763 for reference. Right: reliability diagram showing systematic underconfidence in mid-range LLM predictions across all four conditions</w:t>
       </w:r>
     </w:p>
     <w:p>
@@ -2926,12 +2934,20 @@
       </w:pPr>
       <w:r>
         <w:rPr>
-          <w:i/>
+          <w:b/>
+          <w:i w:val="0"/>
           <w:iCs/>
           <w:sz w:val="20"/>
           <w:szCs w:val="20"/>
         </w:rPr>
-        <w:t xml:space="preserve">Figure 3. Histograms of predicted probabilities across the four LLM conditions. Anchoring on multiples of 0.05 and 0.10 is visible in all four panels and is most extreme in GPT-4o-mini few-shot, which uses only 29 distinct probability values across 1,650 predictions.</w:t>
+        <w:t>Fig. 3</w:t>
+      </w:r>
+      <w:r>
+        <w:rPr>
+          <w:b w:val="0"/>
+          <w:i w:val="0"/>
+        </w:rPr>
+        <w:t xml:space="preserve"> Histograms of predicted probabilities across the four LLM conditions. Anchoring on multiples of 0.05 and 0.10 is visible in all four panels and is most extreme in GPT-4o-mini few-shot, which uses only 29 distinct probability values across 1,650 predictions</w:t>
       </w:r>
     </w:p>
     <w:p>
@@ -4277,12 +4293,20 @@
       </w:pPr>
       <w:r>
         <w:rPr>
-          <w:i/>
+          <w:b/>
+          <w:i w:val="0"/>
           <w:iCs/>
           <w:sz w:val="20"/>
           <w:szCs w:val="20"/>
         </w:rPr>
-        <w:t>Figure 4. Cost vs. test AUC across all evaluated models. The four specialised KT models occupy the upper-left frontier (free, AUC 0.68–0.76). All four LLM conditions are dominated: lower AUC at strictly higher cost. Within the LLM region GPT-4o-mini achieves comparable or slightly higher AUC than Haiku 4.5 at roughly 1/9th to 1/10th the per-prediction cost.</w:t>
+        <w:t>Fig. 4</w:t>
+      </w:r>
+      <w:r>
+        <w:rPr>
+          <w:b w:val="0"/>
+          <w:i w:val="0"/>
+        </w:rPr>
+        <w:t xml:space="preserve"> Cost vs. test AUC across all evaluated models. The four specialised KT models occupy the upper-left frontier (free, AUC 0.68–0.76). All four LLM conditions are dominated: lower AUC at strictly higher cost. Within the LLM region GPT-4o-mini achieves comparable or slightly higher AUC than Haiku 4.5 at roughly 1/9th to 1/10th the per-prediction cost</w:t>
       </w:r>
     </w:p>
     <w:p>

</xml_diff>

<commit_message>
Bump all figures to 600 DPI for journal print-quality compliance
- make_figure.py, make_cost_frontier.py: dpi 150 -> 600
- New scripts (make_calibration_steps_figure.py,
  make_distributions_figure.py) reconstruct the two figures that had
  no generation script in the repo, from the raw
  llm_predictions_*.jsonl checkpoints. Validated against the specific
  numbers already reported in paper_draft.md (position-1/5/10/20 AUC,
  ECE per condition, unique-value counts and top-5 shares) before
  trusting the reconstruction - all matched exactly or closely.
- Embedded copies in submission/manuscript.docx swapped for the new
  600dpi versions, with print dimensions recomputed to match each
  image's actual aspect ratio (no distortion).
</commit_message>
<xml_diff>
--- a/submission/manuscript.docx
+++ b/submission/manuscript.docx
@@ -2765,7 +2765,7 @@
       <w:r>
         <w:drawing>
           <wp:inline distT="0" distB="0" distL="0" distR="0">
-            <wp:extent cx="5715000" cy="2047875"/>
+            <wp:extent cx="5715000" cy="1944243"/>
             <wp:effectExtent t="0" r="0" b="0" l="0"/>
             <wp:docPr id="1" name="figure" descr="Figure 2: Per-position AUC and calibration" title="Figure 2: Per-position AUC and calibration"/>
             <wp:cNvGraphicFramePr>
@@ -2790,7 +2790,7 @@
                   <pic:spPr bwMode="auto">
                     <a:xfrm>
                       <a:off x="0" y="0"/>
-                      <a:ext cx="5715000" cy="2047875"/>
+                      <a:ext cx="5715000" cy="1944243"/>
                     </a:xfrm>
                     <a:prstGeom prst="rect">
                       <a:avLst/>
@@ -2883,7 +2883,7 @@
       <w:r>
         <w:drawing>
           <wp:inline distT="0" distB="0" distL="0" distR="0">
-            <wp:extent cx="5715000" cy="1428750"/>
+            <wp:extent cx="5715000" cy="1282446"/>
             <wp:effectExtent t="0" r="0" b="0" l="0"/>
             <wp:docPr id="1" name="figure" descr="Figure 3: LLM probability output distributions" title="Figure 3: LLM probability output distributions"/>
             <wp:cNvGraphicFramePr>
@@ -2908,7 +2908,7 @@
                   <pic:spPr bwMode="auto">
                     <a:xfrm>
                       <a:off x="0" y="0"/>
-                      <a:ext cx="5715000" cy="1428750"/>
+                      <a:ext cx="5715000" cy="1282446"/>
                     </a:xfrm>
                     <a:prstGeom prst="rect">
                       <a:avLst/>
@@ -4242,7 +4242,7 @@
       <w:r>
         <w:drawing>
           <wp:inline distT="0" distB="0" distL="0" distR="0">
-            <wp:extent cx="4572000" cy="3333750"/>
+            <wp:extent cx="4572000" cy="3568446"/>
             <wp:effectExtent t="0" r="0" b="0" l="0"/>
             <wp:docPr id="1" name="figure" descr="Figure 4: Cost-accuracy frontier" title="Figure 4: Cost-accuracy frontier"/>
             <wp:cNvGraphicFramePr>
@@ -4267,7 +4267,7 @@
                   <pic:spPr bwMode="auto">
                     <a:xfrm>
                       <a:off x="0" y="0"/>
-                      <a:ext cx="4572000" cy="3333750"/>
+                      <a:ext cx="4572000" cy="3568446"/>
                     </a:xfrm>
                     <a:prstGeom prst="rect">
                       <a:avLst/>

</xml_diff>

<commit_message>
Add confirmed DOIs to reference list (APA 7 + DOI requirement)
Added 7 DOIs verified against primary sources (Corbett & Anderson
1994, Feng et al. 2009, Ghosh et al. 2020, Mizumoto & Eguchi 2023,
Nakagawa et al. 2019, Sonkar et al. 2024, Yeung & Yeung 2018). Caught
and corrected one wrong DOI guess for Yeung & Yeung during
verification (.3231645 vs actual .3231647) before it went in.
Remaining references (2026 arXiv preprints, Dai et al. 2023, Hu et
al. 2022, Pandey & Karypis 2019, Piech et al. 2015) have no
confirmed DOI - left as-is per "if available" in the guidelines
rather than guessing.
</commit_message>
<xml_diff>
--- a/submission/manuscript.docx
+++ b/submission/manuscript.docx
@@ -4636,7 +4636,7 @@
           <w:sz w:val="22"/>
           <w:szCs w:val="22"/>
         </w:rPr>
-        <w:t xml:space="preserve">Corbett, A. T., &amp; Anderson, J. R. (1994). Knowledge tracing: Modeling the acquisition of procedural knowledge. User Modeling and User-Adapted Interaction, 4(4), 253–278.</w:t>
+        <w:t>Corbett, A. T., &amp; Anderson, J. R. (1994). Knowledge tracing: Modeling the acquisition of procedural knowledge. User Modeling and User-Adapted Interaction, 4(4), 253–278. https://doi.org/10.1007/BF01099821</w:t>
       </w:r>
     </w:p>
     <w:p>
@@ -4662,20 +4662,20 @@
           <w:sz w:val="22"/>
           <w:szCs w:val="22"/>
         </w:rPr>
-        <w:t xml:space="preserve">Feng, M., Heffernan, N. T., &amp; Koedinger, K. R. (2009). Addressing the assessment challenge in an intelligent tutoring system that tutors as it assesses. User Modeling and User-Adapted Interaction, 19(3), 243–266.</w:t>
-      </w:r>
-    </w:p>
-    <w:p>
-      <w:pPr>
-        <w:spacing w:after="120" w:line="360"/>
-        <w:jc w:val="both"/>
-      </w:pPr>
-      <w:r>
-        <w:rPr>
-          <w:sz w:val="22"/>
-          <w:szCs w:val="22"/>
-        </w:rPr>
-        <w:t xml:space="preserve">Ghosh, A., Heffernan, N., &amp; Lan, A. S. (2020). Context-aware attentive knowledge tracing. Proceedings of the 26th ACM SIGKDD International Conference on Knowledge Discovery &amp; Data Mining.</w:t>
+        <w:t>Feng, M., Heffernan, N. T., &amp; Koedinger, K. R. (2009). Addressing the assessment challenge in an intelligent tutoring system that tutors as it assesses. User Modeling and User-Adapted Interaction, 19(3), 243–266. https://doi.org/10.1007/s11257-009-9063-7</w:t>
+      </w:r>
+    </w:p>
+    <w:p>
+      <w:pPr>
+        <w:spacing w:after="120" w:line="360"/>
+        <w:jc w:val="both"/>
+      </w:pPr>
+      <w:r>
+        <w:rPr>
+          <w:sz w:val="22"/>
+          <w:szCs w:val="22"/>
+        </w:rPr>
+        <w:t>Ghosh, A., Heffernan, N., &amp; Lan, A. S. (2020). Context-aware attentive knowledge tracing. Proceedings of the 26th ACM SIGKDD International Conference on Knowledge Discovery &amp; Data Mining. https://doi.org/10.1145/3394486.3403282</w:t>
       </w:r>
     </w:p>
     <w:p>
@@ -4714,20 +4714,20 @@
           <w:sz w:val="22"/>
           <w:szCs w:val="22"/>
         </w:rPr>
-        <w:t xml:space="preserve">Mizumoto, A., &amp; Eguchi, M. (2023). Exploring the potential of using an AI language model for automated essay scoring. Research Methods in Applied Linguistics, 2(2).</w:t>
-      </w:r>
-    </w:p>
-    <w:p>
-      <w:pPr>
-        <w:spacing w:after="120" w:line="360"/>
-        <w:jc w:val="both"/>
-      </w:pPr>
-      <w:r>
-        <w:rPr>
-          <w:sz w:val="22"/>
-          <w:szCs w:val="22"/>
-        </w:rPr>
-        <w:t xml:space="preserve">Nakagawa, H., Iwasawa, Y., &amp; Matsuo, Y. (2019). Graph-based knowledge tracing: Modeling student proficiency using graph neural network. IEEE/WIC/ACM International Conference on Web Intelligence.</w:t>
+        <w:t>Mizumoto, A., &amp; Eguchi, M. (2023). Exploring the potential of using an AI language model for automated essay scoring. Research Methods in Applied Linguistics, 2(2). https://doi.org/10.1016/j.rmal.2023.100050</w:t>
+      </w:r>
+    </w:p>
+    <w:p>
+      <w:pPr>
+        <w:spacing w:after="120" w:line="360"/>
+        <w:jc w:val="both"/>
+      </w:pPr>
+      <w:r>
+        <w:rPr>
+          <w:sz w:val="22"/>
+          <w:szCs w:val="22"/>
+        </w:rPr>
+        <w:t>Nakagawa, H., Iwasawa, Y., &amp; Matsuo, Y. (2019). Graph-based knowledge tracing: Modeling student proficiency using graph neural network. IEEE/WIC/ACM International Conference on Web Intelligence. https://doi.org/10.1145/3350546.3352513</w:t>
       </w:r>
     </w:p>
     <w:p>
@@ -4792,20 +4792,20 @@
           <w:sz w:val="22"/>
           <w:szCs w:val="22"/>
         </w:rPr>
-        <w:t>Sonkar, S., Liu, N., Le, M., &amp; Baraniuk, R. (2024). MalAlgoQA: Pedagogical evaluation of counterfactual reasoning in large language models and implications for AI in education. Findings of the Association for Computational Linguistics: EMNLP 2024.</w:t>
-      </w:r>
-    </w:p>
-    <w:p>
-      <w:pPr>
-        <w:spacing w:after="120" w:line="360"/>
-        <w:jc w:val="both"/>
-      </w:pPr>
-      <w:r>
-        <w:rPr>
-          <w:sz w:val="22"/>
-          <w:szCs w:val="22"/>
-        </w:rPr>
-        <w:t xml:space="preserve">Yeung, C. K., &amp; Yeung, D. Y. (2018). Addressing two problems in deep knowledge tracing via prediction-consistent regularization. Proceedings of the Fifth Annual ACM Conference on Learning at Scale.</w:t>
+        <w:t>Sonkar, S., Liu, N., Le, M., &amp; Baraniuk, R. (2024). MalAlgoQA: Pedagogical evaluation of counterfactual reasoning in large language models and implications for AI in education. Findings of the Association for Computational Linguistics: EMNLP 2024. https://doi.org/10.18653/v1/2024.findings-emnlp.913</w:t>
+      </w:r>
+    </w:p>
+    <w:p>
+      <w:pPr>
+        <w:spacing w:after="120" w:line="360"/>
+        <w:jc w:val="both"/>
+      </w:pPr>
+      <w:r>
+        <w:rPr>
+          <w:sz w:val="22"/>
+          <w:szCs w:val="22"/>
+        </w:rPr>
+        <w:t>Yeung, C. K., &amp; Yeung, D. Y. (2018). Addressing two problems in deep knowledge tracing via prediction-consistent regularization. Proceedings of the Fifth Annual ACM Conference on Learning at Scale. https://doi.org/10.1145/3231644.3231647</w:t>
       </w:r>
     </w:p>
     <w:sectPr>

</xml_diff>

<commit_message>
Full-text proofread pass: fix citation/reference mismatches and a factual error caught by cross-checking prose against the actual code
- Added missing Liu et al. 2022 (pyKT) reference - was cited in §3.2
  but absent from the reference list
- Added missing in-text citation for Hu et al. 2022 (LoRA) - was in
  the reference list but never actually cited
- Fixed DKT parameter count: "50-thousand-parameter LSTM" -> actual
  count from instantiating models/dkt.py is 127,662 params (~128K)
- Corrected the "history fully present in the prompt" claim in §5.1:
  true for zero-shot only: models/llm_kt.py's few_shot_prompt
  truncates to the most recent 15 interactions. Added a new §5.3
  limitation (now 4, was 3) documenting that the pooled per-position
  AUC result partly conflates model behavior with this truncation.
</commit_message>
<xml_diff>
--- a/submission/manuscript.docx
+++ b/submission/manuscript.docx
@@ -208,7 +208,7 @@
           <w:sz w:val="22"/>
           <w:szCs w:val="22"/>
         </w:rPr>
-        <w:t xml:space="preserve">Three recent studies have begun to test this proposition empirically. Bhattacharyya, Mitton, Abboud, and Woodhead (2026) compared GPT-4o-mini, Gemini 2.5 Flash Lite, Qwen2.5-7B-Instruct, Llama-3.2-1B, and a LoRA fine-tuned Llama-3.2-1B against DKT and SAKT on a real-world online learning dataset, reporting that specialized KT models outperform every evaluated LLM on accuracy and F1, achieve sub-second inference where LLMs require seconds to minutes per student, and cost 600 to 12,000 times less to deploy at scale. Norris, Gal, and Bulathwela (2026) explored an alternative direction — using pretrained LLMs as feature extractors for a downstream KT head rather than as direct predictors — while Scarlatos et al. (2025) demonstrated that hybrid LLM-KT pipelines can improve student-state estimates in dialogue settings, leaving open the question of whether stand-alone LLMs can replace specialized KT models on standard prediction tasks.</w:t>
+        <w:t>Three recent studies have begun to test this proposition empirically. Bhattacharyya, Mitton, Abboud, and Woodhead (2026) compared GPT-4o-mini, Gemini 2.5 Flash Lite, Qwen2.5-7B-Instruct, Llama-3.2-1B, and a LoRA (Hu et al., 2022) fine-tuned Llama-3.2-1B against DKT and SAKT on a real-world online learning dataset, reporting that specialized KT models outperform every evaluated LLM on accuracy and F1, achieve sub-second inference where LLMs require seconds to minutes per student, and cost 600 to 12,000 times less to deploy at scale. Norris, Gal, and Bulathwela (2026) explored an alternative direction — using pretrained LLMs as feature extractors for a downstream KT head rather than as direct predictors — while Scarlatos et al. (2025) demonstrated that hybrid LLM-KT pipelines can improve student-state estimates in dialogue settings, leaving open the question of whether stand-alone LLMs can replace specialized KT models on standard prediction tasks.</w:t>
       </w:r>
     </w:p>
     <w:p>
@@ -645,7 +645,7 @@
           <w:sz w:val="22"/>
           <w:szCs w:val="22"/>
         </w:rPr>
-        <w:t xml:space="preserve">We benchmark four KT models that together span the dominant architectural families in the literature: a probabilistic graphical model (BKT), a recurrent neural network (DKT), and two attention-based transformers (SAKT and AKT). This selection mirrors the baseline lineup of recent KT benchmarking studies (Liu et al., 2022; Bhattacharyya et al., 2026) and lets us anchor our LLM comparison against both classical and modern specialised approaches.</w:t>
+        <w:t>We benchmark four KT models that together span the dominant architectural families in the literature: a probabilistic graphical model (BKT), a recurrent neural network (DKT), and two attention-based transformers (SAKT and AKT). This selection mirrors the baseline lineup of recent KT benchmarking studies (Liu et al., 2022; Bhattacharyya et al., 2026) and lets us anchor our LLM comparison against both classical and modern specialised approaches.</w:t>
       </w:r>
     </w:p>
     <w:p>
@@ -4392,20 +4392,20 @@
           <w:sz w:val="22"/>
           <w:szCs w:val="22"/>
         </w:rPr>
-        <w:t xml:space="preserve">Specialized KT models embed an architectural prior precisely matched to the prediction task. DKT's recurrent state maintains a per-skill knowledge representation that updates with every observation; AKT's monotonic distance-decayed attention biases predictions toward more recent interactions in a way that mirrors how mastery accumulates. The §4.2.1 finding — that LLM AUC is flat across the evaluation sequence (Pearson r = −0.04 with position) — is the direct empirical counterpart: LLMs in our setup do not exploit accumulated history the way specialized models do, even though that history is fully present in the prompt. The architectural commitment to longer-context evidence accumulation is what specialized models bring and LLMs lack.</w:t>
-      </w:r>
-    </w:p>
-    <w:p>
-      <w:pPr>
-        <w:spacing w:after="120" w:line="360"/>
-        <w:jc w:val="both"/>
-      </w:pPr>
-      <w:r>
-        <w:rPr>
-          <w:sz w:val="22"/>
-          <w:szCs w:val="22"/>
-        </w:rPr>
-        <w:t xml:space="preserve">Specialized models are also trained on the target distribution. With 143,429 training interactions, even a 50-thousand-parameter LSTM can learn dataset-specific patterns of skill correlation, item difficulty, and error structure that no pretrained LLM has direct access to. The miscalibration we observe in §4.2.2 (ECE 0.10–0.12) and the probability anchoring in §4.2.3 (29–78 unique probability values clustered at human-readable round numbers) are signatures of an LLM producing tokens rather than optimising a probabilistic objective on the target distribution. A KT model's sigmoid output is continuous and dataset-calibrated by construction; an LLM's textual probability is a sample from a discrete-token distribution with no incentive to be well-calibrated to ASSISTments specifically.</w:t>
+        <w:t>Specialized KT models embed an architectural prior precisely matched to the prediction task. DKT's recurrent state maintains a per-skill knowledge representation that updates with every observation; AKT's monotonic distance-decayed attention biases predictions toward more recent interactions in a way that mirrors how mastery accumulates. The §4.2.1 finding — that LLM AUC is flat across the evaluation sequence (Pearson r = −0.04 with position) — is the direct empirical counterpart: LLMs in our setup do not exploit accumulated history the way specialized models do, even though most of that history is present in the prompt — the full available sequence for zero-shot, and the most recent 15 interactions for few-shot (see §5.3 for the limitation this implies). The architectural commitment to longer-context evidence accumulation is what specialized models bring and LLMs lack.</w:t>
+      </w:r>
+    </w:p>
+    <w:p>
+      <w:pPr>
+        <w:spacing w:after="120" w:line="360"/>
+        <w:jc w:val="both"/>
+      </w:pPr>
+      <w:r>
+        <w:rPr>
+          <w:sz w:val="22"/>
+          <w:szCs w:val="22"/>
+        </w:rPr>
+        <w:t>Specialized models are also trained on the target distribution. With 143,429 training interactions, even a 128-thousand-parameter LSTM can learn dataset-specific patterns of skill correlation, item difficulty, and error structure that no pretrained LLM has direct access to. The miscalibration we observe in §4.2.2 (ECE 0.10–0.12) and the probability anchoring in §4.2.3 (29–78 unique probability values clustered at human-readable round numbers) are signatures of an LLM producing tokens rather than optimising a probabilistic objective on the target distribution. A KT model's sigmoid output is continuous and dataset-calibrated by construction; an LLM's textual probability is a sample from a discrete-token distribution with no incentive to be well-calibrated to ASSISTments specifically.</w:t>
       </w:r>
     </w:p>
     <w:p>
@@ -4500,7 +4500,7 @@
           <w:sz w:val="22"/>
           <w:szCs w:val="22"/>
         </w:rPr>
-        <w:t xml:space="preserve">Three limitations bound the generality of our findings.</w:t>
+        <w:t>Four limitations bound the generality of our findings.</w:t>
       </w:r>
     </w:p>
     <w:p>
@@ -4540,6 +4540,11 @@
           <w:szCs w:val="22"/>
         </w:rPr>
         <w:t xml:space="preserve">Third, our evaluation is on a single dataset (ASSISTments-2009 corrected). Generalisation to other KT datasets is an open question, and the contrast with Bhattacharyya et al. (2026), who reported substantially worse LLM performance on a proprietary dataset, suggests that dataset choice may matter more than provider or prompting strategy. ASSISTments-2009 has well-known idiosyncrasies — heavy skill imbalance, scaffolding artefacts, multi-skill problems — that may interact with LLM performance in ways not captured here.</w:t>
+      </w:r>
+    </w:p>
+    <w:p>
+      <w:r>
+        <w:t>Fourth, the per-position AUC analysis in §4.2.1 pools zero-shot and few-shot conditions, but only zero-shot prompts include a student's full available history; our few-shot prompt truncates to the most recent 15 interactions (§3.3) to keep prompts short and consistent with the in-context examples. The flat AUC trajectory we report is therefore the strongest evidence for zero-shot specifically — for few-shot, some of the flatness may reflect this prompt-level truncation rather than the model's failure to exploit history it never received. A cleaner test would compute per-position AUC separately by condition rather than pooled.</w:t>
       </w:r>
     </w:p>
     <w:p>
@@ -4689,6 +4694,11 @@
           <w:szCs w:val="22"/>
         </w:rPr>
         <w:t xml:space="preserve">Hu, E. J., Shen, Y., Wallis, P., Allen-Zhu, Z., Li, Y., Wang, S., Wang, L., &amp; Chen, W. (2022). LoRA: Low-rank adaptation of large language models. International Conference on Learning Representations.</w:t>
+      </w:r>
+    </w:p>
+    <w:p>
+      <w:r>
+        <w:t>Liu, Z., Liu, Q., Chen, J., Huang, S., Tang, J., &amp; Luo, W. (2022). pyKT: A Python library to benchmark deep learning based knowledge tracing models. Advances in Neural Information Processing Systems 35, Datasets and Benchmarks Track. arXiv:2206.11460. https://arxiv.org/abs/2206.11460</w:t>
       </w:r>
     </w:p>
     <w:p>

</xml_diff>